<commit_message>
hub doc 61 firmado: UST-26 (ver más + ventana) + SIGNED pdf/docx/sha256 + tarjeta
</commit_message>
<xml_diff>
--- a/_integration/docs/ust/UST-2026-09-28-26-steps-overview-3-cifras.docx
+++ b/_integration/docs/ust/UST-2026-09-28-26-steps-overview-3-cifras.docx
@@ -47,7 +47,7 @@
           <w:sz w:val="24"/>
           <w:szCs w:val="24"/>
         </w:rPr>
-        <w:t xml:space="preserve">Movement → «Steps overview»: de 7 cifras a 3 — Today · This phase · This cycle, en ese orden; This month, This quarter, Year to date y All time se retiran de la pantalla</w:t>
+        <w:t xml:space="preserve">Movement → «Steps overview»: Today · This phase · This cycle a la vista, y las otras cuatro cifras (This month · This quarter · Year to date · All time) detrás de un «Ver más» — con la historia de pasos ampliada para que esas cuatro digan la verdad</w:t>
       </w:r>
     </w:p>
     <w:p>
@@ -63,7 +63,7 @@
           <w:sz w:val="20"/>
           <w:szCs w:val="20"/>
         </w:rPr>
-        <w:t xml:space="preserve">PROPUESTA (28-sep, 08:5x). Cambio pequeño y de resta: sin datos nuevos, sin SQL, sin nativo. Sale por OTA 0.23.8 SOLA (un cambio, una OTA, una verificación) cuando Juanjo valide D1–D6. Nada se construye antes.</w:t>
+        <w:t xml:space="preserve">FIRMADA (28-sep). OTA 0.23.8 sola: primero al runtime del móvil de Juanjo, después a los 7.</w:t>
       </w:r>
     </w:p>
     <w:p>
@@ -94,7 +94,7 @@
           <w:sz w:val="20"/>
           <w:szCs w:val="20"/>
         </w:rPr>
-        <w:t xml:space="preserve">Pilar (WhatsApp, 28-sep-2026 09:42 y 09:43, con captura de su iPhone a las 08:41) y Juanjo (chat, 28-sep-2026 ~08:50):</w:t>
+        <w:t xml:space="preserve">Pilar (WhatsApp, 28-sep-2026 09:42 y 09:43, con captura de su iPhone a las 08:41) y Juanjo (chat, 28-sep-2026 ~08:50); decisiones de Juanjo a las ~10:2x:</w:t>
       </w:r>
     </w:p>
     <w:p>
@@ -152,11 +152,27 @@
       <w:r>
         <w:rPr>
           <w:rFonts w:ascii="Aptos" w:cs="Aptos" w:eastAsia="Aptos" w:hAnsi="Aptos"/>
+          <w:i/>
+          <w:iCs/>
           <w:color w:val="1A1818"/>
           <w:sz w:val="20"/>
           <w:szCs w:val="20"/>
         </w:rPr>
-        <w:t xml:space="preserve">Lectura: la tarjeta «Steps overview» de la pestaña Movement (Today) pasa de SIETE cifras (Today · This cycle · This phase · This month · This quarter · Year to date · All time) a TRES, en el orden Today · This phase · This cycle. Las otras cuatro desaparecen de esta pantalla; no se mueven a otra ni a un «ver más». Nada más cambia en la pantalla: la tarjeta STEPS de arriba, el switch de Apple Health/Health Connect, «Choose what to track» y «Manage all devices &amp; apps» quedan como están.</w:t>
+        <w:t xml:space="preserve">Juanjo (decisiones): «D1, Alternativa, un enlace ver mas, D2 Alternativa, D3 Propuesta equilibrada, D4 Propuesta, D5 Alternativa, D6 alternativa».</w:t>
+      </w:r>
+    </w:p>
+    <w:p>
+      <w:pPr>
+        <w:spacing w:after="120" w:before="0"/>
+      </w:pPr>
+      <w:r>
+        <w:rPr>
+          <w:rFonts w:ascii="Aptos" w:cs="Aptos" w:eastAsia="Aptos" w:hAnsi="Aptos"/>
+          <w:color w:val="1A1818"/>
+          <w:sz w:val="20"/>
+          <w:szCs w:val="20"/>
+        </w:rPr>
+        <w:t xml:space="preserve">Lectura firmada: la tarjeta «Steps overview» de Movement (Today) enseña TRES cifras en el orden Today · This phase · This cycle; las otras cuatro (This month · This quarter · Year to date · All time) no desaparecen: se despliegan con un enlace «Ver más» dentro de la misma tarjeta (D1), su cálculo se conserva (D2), y la sincronización amplía la historia de pasos para que esas cuatro sean ciertas (D5). Nada más cambia en la pantalla.</w:t>
       </w:r>
     </w:p>
     <w:p>
@@ -233,7 +249,7 @@
           <w:sz w:val="30"/>
           <w:szCs w:val="30"/>
         </w:rPr>
-        <w:t xml:space="preserve">2 · Lo que la app tiene hoy (28-sep, leído del código)</w:t>
+        <w:t xml:space="preserve">2 · Lo que la app tenía el 28-sep (leído del código, antes de tocar)</w:t>
       </w:r>
     </w:p>
     <w:tbl>
@@ -427,7 +443,7 @@
                 <w:sz w:val="16"/>
                 <w:szCs w:val="16"/>
               </w:rPr>
-              <w:t xml:space="preserve">`src/lib/health/cockpit.ts`: `agregaPasos` (PURA) suma los 7 buckets a partir de las filas de `pasos_por_dia` (RPC v4: una fila por día LOCAL, ventana de 2 años); `BucketPasos` es un tipo cerrado de 7 valores; `inicioTrimestreISO` solo sirve al bucket trimestre. Tests en `src/lib/__tests__/cockpit.test.ts` (agregaPasos por bucket, familiaFase, inicioCicloISO, diasDeFase, zonaHoraria, inicioTrimestreISO).</w:t>
+              <w:t xml:space="preserve">`src/lib/health/cockpit.ts`: `agregaPasos` (PURA) suma los 7 buckets a partir de las filas de `pasos_por_dia` (RPC v4: una fila por día LOCAL, ventana de 2 años); `BucketPasos` tipo cerrado de 7. Tests en `src/lib/__tests__/cockpit.test.ts`. Baseline jest: 28 suites · 482 tests en verde.</w:t>
             </w:r>
           </w:p>
         </w:tc>
@@ -459,7 +475,7 @@
                 <w:sz w:val="16"/>
                 <w:szCs w:val="16"/>
               </w:rPr>
-              <w:t xml:space="preserve">Datos</w:t>
+              <w:t xml:space="preserve">Datos y sincronización</w:t>
             </w:r>
           </w:p>
         </w:tc>
@@ -486,7 +502,7 @@
                 <w:sz w:val="16"/>
                 <w:szCs w:val="16"/>
               </w:rPr>
-              <w:t xml:space="preserve">`health_signal` (pasos por hora fusionados por HealthKit desde la 0.23.5) → `pasos_por_dia` v4. La sincronización (`sync.ts`, `ventanaDeSync`) lee ≤14 días la primera vez y después desde la última señal con 1 día de solape; huecos de más de 14 días sin abrir la app se pierden. Consecuencia: «All time» = lo sincronizado, no la historia; en la captura de Pilar los cuatro largos valen lo mismo que el ciclo.</w:t>
+              <w:t xml:space="preserve">`health_signal` (pasos por hora fusionados por la plataforma) → `pasos_por_dia` v4 (agrupa por hora local y después por día; manda la fila fusionada). `sync.ts` lee con UNA ventana para todas las señales: desde la última señal guardada (1 día de solape) y ≤14 días la primera vez (`ventanaDeSync`). iOS: `queryStatisticsCollectionForQuantity` con intervalo `{hour:1}`; Android: `aggregateGroupByDuration` con `HOURS` (el `.d.ts` de react-native-health-connect admite `DAYS`).</w:t>
             </w:r>
           </w:p>
         </w:tc>
@@ -545,7 +561,7 @@
                 <w:sz w:val="16"/>
                 <w:szCs w:val="16"/>
               </w:rPr>
-              <w:t xml:space="preserve">`mob.wear.b.{today,cycle,phase,month,quarter,ytd,total}` existe en los 14 catálogos (bloque `mob.wear` CERRADO en `catalogos.test.ts`: paridad total exigida). Las 3 etiquetas que quedan ya están traducidas en los 14.</w:t>
+              <w:t xml:space="preserve">`mob.wear.b.{today,cycle,phase,month,quarter,ytd,total}` en los 14 catálogos (bloque `mob.wear` CERRADO en `catalogos.test.ts`: paridad total exigida).</w:t>
             </w:r>
           </w:p>
         </w:tc>
@@ -604,7 +620,7 @@
                 <w:sz w:val="16"/>
                 <w:szCs w:val="16"/>
               </w:rPr>
-              <w:t xml:space="preserve">JS puro → OTA. Última OTA publicada: 0.23.7 (8-sep 22:48Z, O3, en los 7 runtimes); 0.23.6 (UST-14) sigue sin construir; siguiente número libre: 0.23.8. Baseline: appdev `4a75d9f` (8-sep, árbol limpio) · RPC `pasos_por_dia` v4 · ids de OTA por runtime = `tools/ota-baseline.sh` en el Mac como PASO 0 antes de tocar.</w:t>
+              <w:t xml:space="preserve">JS puro → OTA. Última OTA publicada: 0.23.7 (8-sep 22:48Z, en los 7 runtimes); 0.23.6 (UST-14) sin construir; siguiente número libre: 0.23.8. Baseline: appdev `4a75d9f` (8-sep, árbol limpio) · RPC `pasos_por_dia` v4 · ids de OTA por runtime = `tools/ota-baseline.sh` en el Mac como PASO 0.</w:t>
             </w:r>
           </w:p>
         </w:tc>
@@ -663,7 +679,7 @@
                 <w:sz w:val="16"/>
                 <w:szCs w:val="16"/>
               </w:rPr>
-              <w:t xml:space="preserve">27-sep, 🎫 «Apple Health: switch ON…» (creado por SQL desde su feedback): entonces 0 filas en `health_signal`; hoy 2.476 pasos de hoy y 90.839 en la fase. Los datos llegan.</w:t>
+              <w:t xml:space="preserve">27-sep, 🎫 «Apple Health: switch ON…»: entonces 0 filas en `health_signal`; el 28-sep 2.476 pasos de hoy y 90.839 en la fase. Los datos llegan; el ticket sigue abierto hasta la OTA (D6).</w:t>
             </w:r>
           </w:p>
         </w:tc>
@@ -680,7 +696,7 @@
           <w:sz w:val="20"/>
           <w:szCs w:val="20"/>
         </w:rPr>
-        <w:t xml:space="preserve">Analogía: Es como un dashboard con siete paneles donde cuatro leen la misma serie con distinta etiqueta: no informan, distraen. Y uno de ellos («All time») promete un histórico que la fuente no retiene — un contador que se resetea sin decirlo. Se quitan los cuatro y quedan los tres que responden preguntas distintas: hoy, esta fase, este ciclo.</w:t>
+        <w:t xml:space="preserve">Analogía: Es como un dashboard con siete paneles donde cuatro leen la misma serie con distinta etiqueta: no informan, distraen. La solución firmada es la de cualquier dashboard bien hecho: tres paneles a la vista, los otros cuatro detrás de «ver más» — y, ya que se van a ver, que la fuente retenga la historia que prometen (D5).</w:t>
       </w:r>
     </w:p>
     <w:p>
@@ -697,7 +713,7 @@
           <w:sz w:val="30"/>
           <w:szCs w:val="30"/>
         </w:rPr>
-        <w:t xml:space="preserve">3 · Lo que se construirá (F1–F6) y cómo se verificará</w:t>
+        <w:t xml:space="preserve">3 · Lo que se construye (F1–F6, alcance firmado) y cómo se verifica</w:t>
       </w:r>
     </w:p>
     <w:tbl>
@@ -774,7 +790,7 @@
                 <w:sz w:val="16"/>
                 <w:szCs w:val="16"/>
               </w:rPr>
-              <w:t xml:space="preserve">Qué se construirá</w:t>
+              <w:t xml:space="preserve">Qué se construye</w:t>
             </w:r>
           </w:p>
         </w:tc>
@@ -802,7 +818,7 @@
                 <w:sz w:val="16"/>
                 <w:szCs w:val="16"/>
               </w:rPr>
-              <w:t xml:space="preserve">Cómo se verificará</w:t>
+              <w:t xml:space="preserve">Cómo se verifica</w:t>
             </w:r>
           </w:p>
         </w:tc>
@@ -834,7 +850,7 @@
                 <w:sz w:val="16"/>
                 <w:szCs w:val="16"/>
               </w:rPr>
-              <w:t xml:space="preserve">F1 · La tarjeta: 3 cifras, en orden</w:t>
+              <w:t xml:space="preserve">F1 · La tarjeta: 3 cifras + «Ver más» (D1, D3)</w:t>
             </w:r>
           </w:p>
         </w:tc>
@@ -861,7 +877,7 @@
                 <w:sz w:val="16"/>
                 <w:szCs w:val="16"/>
               </w:rPr>
-              <w:t xml:space="preserve">Misma tarjeta (icono + título «Steps overview», mismos estilos), una sola fila de 3 celdas al tercio: **Today · This phase · This cycle**, en ese orden. Sin celdas de mes, trimestre, YTD ni total. El array de celdas de la pantalla pasa de 7 a 3 entradas y define el orden.</w:t>
+              <w:t xml:space="preserve">Misma tarjeta (icono + título «Steps overview», mismos estilos), una fila de 3 celdas iguales al tercio: **Today · This phase · This cycle**. Debajo, un enlace «Ver más ›» que despliega, dentro de la misma tarjeta, las otras cuatro (This month · This quarter · Year to date · All time) y una línea «Datos desde el {primer día con pasos}»; «Ver menos» lo recoge. Plegado por defecto en cada apertura (no se guarda nada).</w:t>
             </w:r>
           </w:p>
         </w:tc>
@@ -888,7 +904,7 @@
                 <w:sz w:val="16"/>
                 <w:szCs w:val="16"/>
               </w:rPr>
-              <w:t xml:space="preserve">Captura en un iPhone Y un Android con la salud conectada (paridad): 3 cifras y ninguna más, en ese orden. Sin salud conectada la tarjeta sigue sin aparecer, como hoy.</w:t>
+              <w:t xml:space="preserve">Captura en un iPhone Y un Android con la salud conectada (paridad): 3 cifras en ese orden y el enlace; al tocarlo, las 4 más y la fecha; sin salud conectada la tarjeta sigue sin aparecer.</w:t>
             </w:r>
           </w:p>
         </w:tc>
@@ -920,7 +936,7 @@
                 <w:sz w:val="16"/>
                 <w:szCs w:val="16"/>
               </w:rPr>
-              <w:t xml:space="preserve">F2 · La lógica se estrecha, no se esconde (D2)</w:t>
+              <w:t xml:space="preserve">F2 · La lógica se conserva (D2)</w:t>
             </w:r>
           </w:p>
         </w:tc>
@@ -947,7 +963,7 @@
                 <w:sz w:val="16"/>
                 <w:szCs w:val="16"/>
               </w:rPr>
-              <w:t xml:space="preserve">`BucketPasos = 'hoy' | 'fase' | 'ciclo'`; `PasosCockpit` con 3 claves; `agregaPasos` deja de calcular mes/trimestre/ytd/total; `inicioTrimestreISO` se retira (solo servía al trimestre). Código sin consumidor es deuda (r11c-2); git conserva la versión de 7 por si UST-23 (Trends) la necesita — y entonces volvería con su UST y sus tests.</w:t>
+              <w:t xml:space="preserve">`BucketPasos` sigue con 7 buckets y `agregaPasos` no cambia. Se añade `primerDiaConPasos(filas)` (PURA, con unitarios) para la línea «Datos desde», y `cargarCockpitPasos` devuelve además ese día.</w:t>
             </w:r>
           </w:p>
         </w:tc>
@@ -974,7 +990,7 @@
                 <w:sz w:val="16"/>
                 <w:szCs w:val="16"/>
               </w:rPr>
-              <w:t xml:space="preserve">jest: los casos de hoy/fase/ciclo de `cockpit.test.ts` se conservan tal cual; los de mes/trimestre/ytd/total y `inicioTrimestreISO` se retiran. `tsc` 0. El tipo cerrado de 3 es el guardarraíl: una cuarta cifra no compila.</w:t>
+              <w:t xml:space="preserve">jest: `cockpit.test.ts` intacto + casos nuevos de `primerDiaConPasos` (vacío → null; ignora filas a 0; el más antiguo). `tsc` 0.</w:t>
             </w:r>
           </w:p>
         </w:tc>
@@ -1033,7 +1049,7 @@
                 <w:sz w:val="16"/>
                 <w:szCs w:val="16"/>
               </w:rPr>
-              <w:t xml:space="preserve">De lo inmediato a lo largo, como pide Juanjo: Today (hoy), This phase (los días de la fase actual del ciclo en curso, calculados del ciclo), This cycle (desde el día 1). Las definiciones no cambian.</w:t>
+              <w:t xml:space="preserve">De lo inmediato a lo largo, como pide Juanjo: Today, This phase (días de la fase actual del ciclo en curso, calculados del ciclo), This cycle (desde el día 1). Las definiciones no cambian; el array de celdas de la pantalla fija el orden.</w:t>
             </w:r>
           </w:p>
         </w:tc>
@@ -1060,7 +1076,7 @@
                 <w:sz w:val="16"/>
                 <w:szCs w:val="16"/>
               </w:rPr>
-              <w:t xml:space="preserve">Un test de `agregaPasos` fija que las claves salen en ese orden (`Object.keys`) y que fase ⊆ ciclo.</w:t>
+              <w:t xml:space="preserve">Test de la pantalla no hay (jest de lógica pura): el orden se verifica en la captura; las definiciones, en los tests de `agregaPasos` que ya existen.</w:t>
             </w:r>
           </w:p>
         </w:tc>
@@ -1092,7 +1108,7 @@
                 <w:sz w:val="16"/>
                 <w:szCs w:val="16"/>
               </w:rPr>
-              <w:t xml:space="preserve">F4 · Idiomas: 4 claves menos en los 14</w:t>
+              <w:t xml:space="preserve">F4 · Idiomas: 3 claves nuevas en los 14</w:t>
             </w:r>
           </w:p>
         </w:tc>
@@ -1119,7 +1135,7 @@
                 <w:sz w:val="16"/>
                 <w:szCs w:val="16"/>
               </w:rPr>
-              <w:t xml:space="preserve">Se retiran `mob.wear.b.month/quarter/ytd/total` de los 14 catálogos (no quedan claves muertas); `today/phase/cycle` siguen. Nada nuevo que traducir.</w:t>
+              <w:t xml:space="preserve">`mob.wear.verMas` («Ver más»), `mob.wear.verMenos` («Ver menos») y `mob.wear.datosDesde` («Datos desde el {d}») en los 14 catálogos; las 7 etiquetas de buckets se quedan.</w:t>
             </w:r>
           </w:p>
         </w:tc>
@@ -1146,7 +1162,7 @@
                 <w:sz w:val="16"/>
                 <w:szCs w:val="16"/>
               </w:rPr>
-              <w:t xml:space="preserve">`catalogos.test.ts` (bloque `mob.wear` cerrado) sigue en verde: paridad 14/14.</w:t>
+              <w:t xml:space="preserve">`catalogos.test.ts` (bloque `mob.wear` cerrado): paridad 14/14, sin vacíos, sin copias del inglés.</w:t>
             </w:r>
           </w:p>
         </w:tc>
@@ -1178,7 +1194,7 @@
                 <w:sz w:val="16"/>
                 <w:szCs w:val="16"/>
               </w:rPr>
-              <w:t xml:space="preserve">F5 · Lo que NO cambia</w:t>
+              <w:t xml:space="preserve">F5 · Historia de pasos ampliada (D5) — solo pasos, diaria, una vez</w:t>
             </w:r>
           </w:p>
         </w:tc>
@@ -1205,7 +1221,7 @@
                 <w:sz w:val="16"/>
                 <w:szCs w:val="16"/>
               </w:rPr>
-              <w:t xml:space="preserve">La tarjeta STEPS de arriba (`pasosDeHoy`), el switch de Apple Health / Health Connect, «Choose what to track», «Manage all devices &amp; apps», el checklist de movimiento, la RPC `pasos_por_dia`, `health_signal`, la sincronización (ventana de 14 días: se documenta, no se toca en esta UST). Ningún cambio de plataforma: la misma tarjeta en iOS y Android.</w:t>
+              <w:t xml:space="preserve">En la sincronización, DESPUÉS de la ventana normal (que no cambia: ≤14 días, todas las señales, por horas), un relleno de PASOS de hasta 2 años (la misma ventana que lee `pasos_por_dia`) en buckets DIARIOS fusionados por la plataforma, solo para los días anteriores al primero que ya tiene horas; se ejecuta una vez por arranque de app y solo si el dato más antiguo guardado es más reciente que la ventana. iOS: `queryStatisticsCollectionForQuantity` con intervalo `{day:1}` (mismo módulo, `hkPasosPorDia`). Android: `aggregateGroupByDuration` con `DAYS` (`hcPasosPorDia`) — **desviación TEMPORAL declarada**: Health Connect solo entrega los 30 días anteriores a la concesión del permiso salvo con `android.permission.health.READ_HEALTH_DATA_HISTORY`, que es un permiso del manifest (build nativo) → entra en 0.24.0; hasta entonces «All time» en Android = lo que Health Connect deja leer, y la línea «Datos desde» lo dice. Coste: ≤730 filas por usuaria una sola vez (4 lotes de 200) frente a 17.520 si se rellenara por horas; el resto de señales conserva 14 días (sin consumidor hoy: coste sin beneficio).</w:t>
             </w:r>
           </w:p>
         </w:tc>
@@ -1232,7 +1248,7 @@
                 <w:sz w:val="16"/>
                 <w:szCs w:val="16"/>
               </w:rPr>
-              <w:t xml:space="preserve">`git diff --stat` real en el as-built: MovementLogScreen (≈20 líneas), cockpit.ts, cockpit.test.ts, 14 json — y nada más.</w:t>
+              <w:t xml:space="preserve">Unitarios de la parte pura (`diasARellenar`: rango, corte en el día anterior al primero con horas, vacío cuando no hace falta). En el iPhone de Juanjo: tras la OTA, «Ver más» enseña Year to date y All time distintos de This cycle y «Datos desde» una fecha de meses atrás; en la base, filas `steps` con `metadata.granularidad = 'dia'` anteriores al 14-sep. Android: la fecha de «Datos desde» ≈ 30 días antes de la conexión.</w:t>
             </w:r>
           </w:p>
         </w:tc>
@@ -1264,7 +1280,7 @@
                 <w:sz w:val="16"/>
                 <w:szCs w:val="16"/>
               </w:rPr>
-              <w:t xml:space="preserve">F6 · Entrega OTA 0.23.8, sola</w:t>
+              <w:t xml:space="preserve">F6 · Entrega OTA 0.23.8, sola (D4)</w:t>
             </w:r>
           </w:p>
         </w:tc>
@@ -1291,7 +1307,7 @@
                 <w:sz w:val="16"/>
                 <w:szCs w:val="16"/>
               </w:rPr>
-              <w:t xml:space="preserve">PASO 0 `ota-baseline.sh` → dev (media jornada) → jest + tsc + `expo config` → publicar primero SOLO al runtime del móvil de Juanjo (patrón r26-p) → captura iPhone + Android → los 7 runtimes → `curl u.expo.dev` por runtime → What to Test. Cierre: 0.23.8 en el CHECK de releases + fila en 🚢 + item hecho + as-built con desviaciones.</w:t>
+              <w:t xml:space="preserve">PASO 0 `ota-baseline.sh` → dev → jest + tsc + `expo config` → publicar primero SOLO al runtime del móvil de Juanjo (patrón r26-p) → captura iPhone + Android → los 7 runtimes → `curl u.expo.dev` por runtime → What to Test. Cierre: 0.23.8 en el CHECK de releases + fila en 🚢 + item hecho + ticket de Pilar resuelto con la nota de la release (D6) + as-built con desviaciones.</w:t>
             </w:r>
           </w:p>
         </w:tc>
@@ -1318,7 +1334,7 @@
                 <w:sz w:val="16"/>
                 <w:szCs w:val="16"/>
               </w:rPr>
-              <w:t xml:space="preserve">DoD: en el móvil de Juanjo y en el de Pilar la tarjeta enseña Today · This phase · This cycle y nada más; el resto de la pantalla idéntico. Marcha atrás: `Rollback OTA NutriSync.command` al mensaje de la OTA anterior.</w:t>
+              <w:t xml:space="preserve">DoD: en el móvil de Juanjo y en el de Pilar la tarjeta enseña Today · This phase · This cycle + «Ver más» con las cuatro y la fecha; el resto de la pantalla idéntico. Marcha atrás: `Rollback OTA NutriSync.command` al mensaje de la OTA anterior.</w:t>
             </w:r>
           </w:p>
         </w:tc>
@@ -1502,7 +1518,7 @@
                 <w:sz w:val="16"/>
                 <w:szCs w:val="16"/>
               </w:rPr>
-              <w:t xml:space="preserve">`src/screens/main/MovementLogScreen.tsx` (bloque r24-o: array de celdas 7 → 3, orden) · `src/lib/health/cockpit.ts` (tipo, `agregaPasos`, retirar `inicioTrimestreISO`) · `src/lib/__tests__/cockpit.test.ts` · `src/i18n/*.json` ×14 (−4 claves en `mob.wear.b`).</w:t>
+              <w:t xml:space="preserve">`src/screens/main/MovementLogScreen.tsx` (bloque r24-o: 3 celdas + «Ver más» + 4 celdas + «Datos desde») · `src/lib/health/cockpit.ts` (`primerDiaConPasos`, retorno con `primerDia`) · `src/lib/health/sync.ts` (relleno diario de pasos, una vez) · `src/lib/health/healthkit.ts` (`hkPasosPorDia`) · `src/lib/health/healthconnect.ts` (`hcPasosPorDia`) · `src/lib/health/adaptador.ts` (contrato) · tests · `src/i18n/*.json` ×14 (+3 claves en `mob.wear`).</w:t>
             </w:r>
           </w:p>
         </w:tc>
@@ -1529,7 +1545,7 @@
                 <w:sz w:val="16"/>
                 <w:szCs w:val="16"/>
               </w:rPr>
-              <w:t xml:space="preserve">`sync.ts`, `pasosDeHoy`, `connections`, `HealthConsent`, `cas.ts`, `app.json`, RUNTIMES, nada nativo, nada de Android-específico.</w:t>
+              <w:t xml:space="preserve">`pasosDeHoy`, `connections`, `HealthConsent`, `cas.ts`, `app.json`, RUNTIMES, nada nativo. La ventana normal de sincronización (14 días, todas las señales) no cambia.</w:t>
             </w:r>
           </w:p>
         </w:tc>
@@ -1588,7 +1604,7 @@
                 <w:sz w:val="16"/>
                 <w:szCs w:val="16"/>
               </w:rPr>
-              <w:t xml:space="preserve">Nada.</w:t>
+              <w:t xml:space="preserve">Nada de esquema. Filas nuevas en `health_signal`: hasta 730 por usuaria iOS con historia (type `steps`, `metadata.fuente = hk_merged`, `granularidad = 'dia'`), una sola vez. `pasos_por_dia` v4 las suma tal cual (el bucket diario cae en la hora 23 de su día; ningún día tiene a la vez filas por hora y por día).</w:t>
             </w:r>
           </w:p>
         </w:tc>
@@ -1615,7 +1631,7 @@
                 <w:sz w:val="16"/>
                 <w:szCs w:val="16"/>
               </w:rPr>
-              <w:t xml:space="preserve">`pasos_por_dia` v4, `health_signal`, tablas.</w:t>
+              <w:t xml:space="preserve">`pasos_por_dia`, RLS, tablas.</w:t>
             </w:r>
           </w:p>
         </w:tc>
@@ -1760,7 +1776,7 @@
                 <w:sz w:val="16"/>
                 <w:szCs w:val="16"/>
               </w:rPr>
-              <w:t xml:space="preserve">Bajo: es una resta. El único error posible es de orden o de etiqueta, y lo cazan el test de orden y la captura.</w:t>
+              <w:t xml:space="preserve">Bajo en la tarjeta (resta + un desplegable). Medio-bajo en el relleno: es una lectura más de HealthKit una vez por arranque, acotada (≤730 buckets) y con subida idempotente (índice único user·provider·type·start_ts); si falla, no toca nada de lo demás (la sincronización normal ya terminó).</w:t>
             </w:r>
           </w:p>
         </w:tc>
@@ -1804,7 +1820,7 @@
           <w:sz w:val="20"/>
           <w:szCs w:val="20"/>
         </w:rPr>
-        <w:t xml:space="preserve">Estimación: media jornada de dev + verificación en dos móviles. Un cambio, una OTA (0.23.8), una verificación — no se junta con UST-14 (0.23.6) ni con ninguna otra corrección (regla 7-sep).</w:t>
+        <w:t xml:space="preserve">Estimación: una jornada de dev (pantalla + relleno en dos adaptadores + tests) + verificación en dos móviles. Un cambio, una OTA (0.23.8), una verificación — no se junta con UST-14 (0.23.6) ni con ninguna otra corrección (regla 7-sep).</w:t>
       </w:r>
     </w:p>
     <w:p>
@@ -1821,7 +1837,7 @@
           <w:sz w:val="30"/>
           <w:szCs w:val="30"/>
         </w:rPr>
-        <w:t xml:space="preserve">5 · Decisiones (D1–D5 Juanjo, carril técnico; Pilar y Lucía corroboran · D6 Juanjo/Pilar)</w:t>
+        <w:t xml:space="preserve">5 · Decisiones (D1–D5 Juanjo, carril técnico; Pilar y Lucía corroboran · D6 Juanjo/Pilar) — DECIDIDAS el 28-sep</w:t>
       </w:r>
     </w:p>
     <w:tbl>
@@ -2069,7 +2085,7 @@
                 <w:sz w:val="16"/>
                 <w:szCs w:val="16"/>
               </w:rPr>
-              <w:t xml:space="preserve"/>
+              <w:t xml:space="preserve">ALTERNATIVA (Juanjo, 28-sep): «un enlace ver más» — Today · This phase · This cycle a la vista; This month · This quarter · Year to date · All time detrás de «Ver más», dentro de la misma tarjeta, con la línea «Datos desde el {fecha}».</w:t>
             </w:r>
           </w:p>
         </w:tc>
@@ -2128,7 +2144,7 @@
                 <w:sz w:val="16"/>
                 <w:szCs w:val="16"/>
               </w:rPr>
-              <w:t xml:space="preserve">Retirar también el CÁLCULO (lógica pura, tipo y tests) de mes/trimestre/YTD/total, no solo su pintado: código sin consumidor es deuda; si UST-23 (Trends) los necesita, vuelven con su UST y sus tests.</w:t>
+              <w:t xml:space="preserve">Retirar también el CÁLCULO (lógica pura, tipo y tests) de mes/trimestre/YTD/total, no solo su pintado.</w:t>
             </w:r>
           </w:p>
         </w:tc>
@@ -2183,7 +2199,7 @@
                 <w:sz w:val="16"/>
                 <w:szCs w:val="16"/>
               </w:rPr>
-              <w:t xml:space="preserve"/>
+              <w:t xml:space="preserve">ALTERNATIVA (Juanjo): se conserva el cálculo de los 7 buckets (lo exige D1); `inicioTrimestreISO` y sus tests se quedan.</w:t>
             </w:r>
           </w:p>
         </w:tc>
@@ -2242,7 +2258,7 @@
                 <w:sz w:val="16"/>
                 <w:szCs w:val="16"/>
               </w:rPr>
-              <w:t xml:space="preserve">Diseño: misma tarjeta, mismos estilos, una fila de 3 al tercio. Es una resta, no necesita pantalla de Lucía; si Lucía quiere otra jerarquía (p. ej. la cifra de hoy más grande), entra en esta OTA si llega antes de construir, o en la siguiente.</w:t>
+              <w:t xml:space="preserve">Diseño: misma tarjeta, mismos estilos, una fila de 3 al tercio. Es una resta, no necesita pantalla de Lucía.</w:t>
             </w:r>
           </w:p>
         </w:tc>
@@ -2297,7 +2313,7 @@
                 <w:sz w:val="16"/>
                 <w:szCs w:val="16"/>
               </w:rPr>
-              <w:t xml:space="preserve"/>
+              <w:t xml:space="preserve">PROPUESTA, «equilibrada» (Juanjo): misma tarjeta y estilos, las tres celdas iguales al tercio; sin esperar pantalla de Lucía, que corrobora después.</w:t>
             </w:r>
           </w:p>
         </w:tc>
@@ -2411,7 +2427,7 @@
                 <w:sz w:val="16"/>
                 <w:szCs w:val="16"/>
               </w:rPr>
-              <w:t xml:space="preserve"/>
+              <w:t xml:space="preserve">PROPUESTA (Juanjo): OTA 0.23.8 SOLA, primero al runtime del móvil de Juanjo, después a los 7; What to Test para las dos tiendas; paso 0 ota-baseline.sh.</w:t>
             </w:r>
           </w:p>
         </w:tc>
@@ -2470,7 +2486,7 @@
                 <w:sz w:val="16"/>
                 <w:szCs w:val="16"/>
               </w:rPr>
-              <w:t xml:space="preserve">La ventana de sincronización de 14 días se DOCUMENTA en esta UST y no se toca: cambiarla (p. ej. 90 días la primera vez) es otra UST con su análisis de coste (muestras por hora × días) y no hace falta para las tres cifras que quedan.</w:t>
+              <w:t xml:space="preserve">La ventana de sincronización de 14 días se DOCUMENTA en esta UST y no se toca.</w:t>
             </w:r>
           </w:p>
         </w:tc>
@@ -2525,7 +2541,7 @@
                 <w:sz w:val="16"/>
                 <w:szCs w:val="16"/>
               </w:rPr>
-              <w:t xml:space="preserve"/>
+              <w:t xml:space="preserve">ALTERNATIVA (Juanjo): ampliar la ventana en esta misma OTA — aplicada a los PASOS (lo que la tarjeta enseña): relleno diario de hasta 2 años una sola vez; el resto de señales conserva 14 días. Android limitado a 30 días hasta 0.24.0 (READ_HEALTH_DATA_HISTORY es nativo): desviación temporal declarada en F5.</w:t>
             </w:r>
           </w:p>
         </w:tc>
@@ -2584,7 +2600,7 @@
                 <w:sz w:val="16"/>
                 <w:szCs w:val="16"/>
               </w:rPr>
-              <w:t xml:space="preserve">Ticket de Pilar (27-sep, Apple Health sin datos): se cierra en 🎫 con la causa que Juanjo/Pilar vieron al revisarlo (hipótesis r24-l: permiso de LECTURA en Ajustes → Salud → Apps → NutriSync, que HealthKit no delata) y una respuesta a Pilar. No depende de esta OTA.</w:t>
+              <w:t xml:space="preserve">Ticket de Pilar (27-sep, Apple Health sin datos): se cierra en 🎫 ya, con la causa observada.</w:t>
             </w:r>
           </w:p>
         </w:tc>
@@ -2639,7 +2655,7 @@
                 <w:sz w:val="16"/>
                 <w:szCs w:val="16"/>
               </w:rPr>
-              <w:t xml:space="preserve"/>
+              <w:t xml:space="preserve">ALTERNATIVA (Juanjo): el ticket de Pilar (Apple Health) se deja abierto hasta la OTA 0.23.8 y se resuelve con su nota de release como respuesta.</w:t>
             </w:r>
           </w:p>
         </w:tc>
@@ -2794,7 +2810,7 @@
                 <w:sz w:val="16"/>
                 <w:szCs w:val="16"/>
               </w:rPr>
-              <w:t xml:space="preserve">Firma de Juanjo (D1–D6) · `tools/ota-baseline.sh` en el Mac (ids de los 14 update-id) · `backup-estado` verde · appdev limpio en `4a75d9f`.</w:t>
+              <w:t xml:space="preserve">Firma de Juanjo (D1–D6) ✓ (28-sep) · `tools/ota-baseline.sh` en el Mac (ids de los 14 update-id) · `backup-estado` verde · appdev limpio en `4a75d9f`.</w:t>
             </w:r>
           </w:p>
         </w:tc>
@@ -2853,7 +2869,7 @@
                 <w:sz w:val="16"/>
                 <w:szCs w:val="16"/>
               </w:rPr>
-              <w:t xml:space="preserve">Un commit en appdev con su mensaje; jest (cockpit + catálogos) y tsc 0; `npx expo config --type public` OK.</w:t>
+              <w:t xml:space="preserve">Un commit en appdev con su mensaje; jest (cockpit + sync puro + catálogos) y tsc 0; `npx expo config --type public` OK.</w:t>
             </w:r>
           </w:p>
         </w:tc>
@@ -2971,7 +2987,7 @@
                 <w:sz w:val="16"/>
                 <w:szCs w:val="16"/>
               </w:rPr>
-              <w:t xml:space="preserve">En un iPhone y un Android con la salud conectada: Steps overview = Today · This phase · This cycle, en ese orden, y nada más; el resto de Movement idéntico. Pilar lo ve en su móvil (cerrar la app dos veces).</w:t>
+              <w:t xml:space="preserve">En un iPhone y un Android con la salud conectada: Steps overview = Today · This phase · This cycle + «Ver más» → las cuatro + «Datos desde»; en iPhone la fecha es de meses atrás y Year to date ≠ This cycle; el resto de Movement idéntico. Pilar lo ve en su móvil (cerrar la app dos veces).</w:t>
             </w:r>
           </w:p>
         </w:tc>
@@ -3030,7 +3046,7 @@
                 <w:sz w:val="16"/>
                 <w:szCs w:val="16"/>
               </w:rPr>
-              <w:t xml:space="preserve">`tools/Rollback OTA NutriSync.command` con un trozo del mensaje de la OTA anterior (republica el estado bueno en los 7). Sin SQL que revertir.</w:t>
+              <w:t xml:space="preserve">`tools/Rollback OTA NutriSync.command` con un trozo del mensaje de la OTA anterior (republica el estado bueno en los 7). Las filas diarias de relleno son inertes para la versión anterior (misma tabla, mismo RPC).</w:t>
             </w:r>
           </w:p>
         </w:tc>
@@ -3064,7 +3080,7 @@
           <w:sz w:val="20"/>
           <w:szCs w:val="20"/>
         </w:rPr>
-        <w:t xml:space="preserve">1. Movement → tarjeta «Steps overview»: ahora solo tres cifras, Today · This phase · This cycle, en ese orden. Desaparecen This month, This quarter, Year to date y All time.</w:t>
+        <w:t xml:space="preserve">1. Movement → tarjeta «Steps overview»: tres cifras a la vista, Today · This phase · This cycle, en ese orden. Debajo, «Ver más» despliega This month, This quarter, Year to date y All time, con la fecha desde la que hay datos.</w:t>
       </w:r>
     </w:p>
     <w:p>
@@ -3078,7 +3094,7 @@
           <w:sz w:val="20"/>
           <w:szCs w:val="20"/>
         </w:rPr>
-        <w:t xml:space="preserve">2. Todo lo demás de la pantalla sigue igual: pasos de hoy arriba, Apple Health / Health Connect, «Choose what to track», el registro del movimiento.</w:t>
+        <w:t xml:space="preserve">2. En iPhone, tras abrir la app, All time y Year to date crecen con tu historial de pasos de Salud (hasta dos años); en Android, con lo que Health Connect deja leer (30 días) hasta la siguiente versión de tienda.</w:t>
       </w:r>
     </w:p>
     <w:p>
@@ -3092,7 +3108,7 @@
           <w:sz w:val="20"/>
           <w:szCs w:val="20"/>
         </w:rPr>
-        <w:t xml:space="preserve">3. Si no tienes la salud conectada, la tarjeta no aparece (como hasta ahora).</w:t>
+        <w:t xml:space="preserve">3. Todo lo demás de la pantalla sigue igual: pasos de hoy arriba, Apple Health / Health Connect, «Choose what to track», el registro del movimiento.</w:t>
       </w:r>
     </w:p>
     <w:p>
@@ -3244,7 +3260,7 @@
                 <w:sz w:val="16"/>
                 <w:szCs w:val="16"/>
               </w:rPr>
-              <w:t xml:space="preserve">«All time» sumaba lo que la app había sincronizado (≤14 días la primera vez, huecos perdidos), no toda la historia de la usuaria: un total que no puede ser total confunde más que ayuda. Antes de pintar un acumulado largo, comprobar que la fuente lo retiene.</w:t>
+              <w:t xml:space="preserve">«All time» sumaba lo que la app había sincronizado (≤14 días la primera vez), no toda la historia. La decisión firmada no la esconde: la hace verdad ampliando la historia (D5) y, donde no puede (Android sin permiso de historia), lo dice en pantalla («Datos desde»).</w:t>
             </w:r>
           </w:p>
         </w:tc>
@@ -3303,7 +3319,66 @@
                 <w:sz w:val="16"/>
                 <w:szCs w:val="16"/>
               </w:rPr>
-              <w:t xml:space="preserve">Pilar lo vio en un vistazo con datos reales; el cockpit r24-o (3-sep) se diseñó desde el código, sin una captura de tester delante. Las tarjetas de datos se validan con datos de una usuaria real antes de crecer.</w:t>
+              <w:t xml:space="preserve">Pilar lo vio en un vistazo con datos reales; el cockpit r24-o se diseñó desde el código, sin una captura de tester delante. Las tarjetas de datos se validan con datos de una usuaria real antes de crecer.</w:t>
+            </w:r>
+          </w:p>
+        </w:tc>
+      </w:tr>
+      <w:tr>
+        <w:trPr>
+          <w:cantSplit/>
+        </w:trPr>
+        <w:tc>
+          <w:tcPr>
+            <w:tcW w:type="dxa" w:w="2678"/>
+            <w:tcMar>
+              <w:top w:type="dxa" w:w="70"/>
+              <w:left w:type="dxa" w:w="100"/>
+              <w:bottom w:type="dxa" w:w="70"/>
+              <w:right w:type="dxa" w:w="100"/>
+            </w:tcMar>
+          </w:tcPr>
+          <w:p>
+            <w:pPr>
+              <w:spacing w:after="40"/>
+            </w:pPr>
+            <w:r>
+              <w:rPr>
+                <w:rFonts w:ascii="Aptos" w:cs="Aptos" w:eastAsia="Aptos" w:hAnsi="Aptos"/>
+                <w:b/>
+                <w:bCs/>
+                <w:color w:val="6B6B6B"/>
+                <w:sz w:val="16"/>
+                <w:szCs w:val="16"/>
+              </w:rPr>
+              <w:t xml:space="preserve">Una alternativa firmada también se acota</w:t>
+            </w:r>
+          </w:p>
+        </w:tc>
+        <w:tc>
+          <w:tcPr>
+            <w:tcW w:type="dxa" w:w="7622"/>
+            <w:tcMar>
+              <w:top w:type="dxa" w:w="70"/>
+              <w:left w:type="dxa" w:w="100"/>
+              <w:bottom w:type="dxa" w:w="70"/>
+              <w:right w:type="dxa" w:w="100"/>
+            </w:tcMar>
+          </w:tcPr>
+          <w:p>
+            <w:pPr>
+              <w:spacing w:after="40"/>
+            </w:pPr>
+            <w:r>
+              <w:rPr>
+                <w:rFonts w:ascii="Aptos" w:cs="Aptos" w:eastAsia="Aptos" w:hAnsi="Aptos"/>
+                <w:b w:val="false"/>
+                <w:bCs w:val="false"/>
+                <w:color w:val="6B6B6B"/>
+                <w:sz w:val="16"/>
+                <w:szCs w:val="16"/>
+              </w:rPr>
+              <w:t xml:space="preserve">«Ampliar la ventana» sin más habría multiplicado por 24 las filas (por horas) y arrastrado señales sin consumidor; se aplica a lo que la tarjeta enseña, por días y una vez — y la acotación se declara en la UST, no se decide en silencio.</w:t>
             </w:r>
           </w:p>
         </w:tc>
@@ -3458,7 +3533,7 @@
                 <w:sz w:val="16"/>
                 <w:szCs w:val="16"/>
               </w:rPr>
-              <w:t xml:space="preserve">Este documento (propuesta, 28-sep 08:5x).</w:t>
+              <w:t xml:space="preserve">Propuesta 28-sep 09:5x (commit 373ce62) → FIRMADA 28-sep 10:2x (este documento).</w:t>
             </w:r>
           </w:p>
         </w:tc>
@@ -3576,7 +3651,7 @@
                 <w:sz w:val="16"/>
                 <w:szCs w:val="16"/>
               </w:rPr>
-              <w:t xml:space="preserve">Media jornada: pantalla + lógica + tests + 14 catálogos, un commit en appdev.</w:t>
+              <w:t xml:space="preserve">Una jornada: pantalla (3 + ver más) · cockpit (`primerDiaConPasos`) · sync (relleno diario, una vez) · adaptadores (`pasosPorDia` iOS/Android) · tests · 14 catálogos; un commit en appdev.</w:t>
             </w:r>
           </w:p>
         </w:tc>
@@ -3635,7 +3710,7 @@
                 <w:sz w:val="16"/>
                 <w:szCs w:val="16"/>
               </w:rPr>
-              <w:t xml:space="preserve">jest (cockpit, catálogos) · tsc 0 · expo config · captura iPhone + Android.</w:t>
+              <w:t xml:space="preserve">jest (cockpit, sync puro, catálogos) · tsc 0 · expo config · captura iPhone + Android.</w:t>
             </w:r>
           </w:p>
         </w:tc>
@@ -3812,7 +3887,7 @@
                 <w:sz w:val="16"/>
                 <w:szCs w:val="16"/>
               </w:rPr>
-              <w:t xml:space="preserve">Doc 61 + adjunto; item en 📚 (propuesto → aceptado S19 al firmar → hecho con la 0.23.8 en 🚢); as-built con desviaciones; Notion sin bloques → hub.</w:t>
+              <w:t xml:space="preserve">Doc 61 firmado + adjuntos SIGNED; item S19 · aceptado · 0.23.8 → hecho con la release en 🚢; ticket de Pilar resuelto con la nota (D6); as-built con desviaciones; Notion sin bloques → hub.</w:t>
             </w:r>
           </w:p>
         </w:tc>

</xml_diff>

<commit_message>
UST-26 as-built (OTA 0.23.8 publicada 28-sep 21:28, 7 runtimes; iPhone OK, Android pendiente): doc 61 + PDF/Word as-built + propuesta-firmada.pdf conservada; tarjeta 61 (po266)
</commit_message>
<xml_diff>
--- a/_integration/docs/ust/UST-2026-09-28-26-steps-overview-3-cifras.docx
+++ b/_integration/docs/ust/UST-2026-09-28-26-steps-overview-3-cifras.docx
@@ -63,7 +63,7 @@
           <w:sz w:val="20"/>
           <w:szCs w:val="20"/>
         </w:rPr>
-        <w:t xml:space="preserve">FIRMADA (28-sep). OTA 0.23.8 sola: primero al runtime del móvil de Juanjo, después a los 7.</w:t>
+        <w:t xml:space="preserve">PUBLICADA · OTA 0.23.8 en los 7 runtimes el 28-sep 21:26–21:28 EEST (14 update-id medidos con ota-baseline a las 21:34) · verificada en el iPhone de Juanjo (runtime 0.23.1: «OK» a las tres cifras, «Ver más» y «Datos desde») · ANDROID PENDIENTE de verificación humana (la tarjeta solo aparece con Health Connect conectado en 0.23.0/0.23.1 y el Android de Juanjo sigue en 0.22.0: se comprueba junto con la 0.23.7) · Pilar: pendiente de cerrar la app dos veces y mirar Movement · ticket NS-0080 resuelto con la nota de la release (D6) en el SQL de cierre. Lo que se afirma abajo está medido (ota-baseline, jest, pwa-tests, arnés PG16) o leído del commit 5741f18.</w:t>
       </w:r>
     </w:p>
     <w:p>
@@ -713,7 +713,7 @@
           <w:sz w:val="30"/>
           <w:szCs w:val="30"/>
         </w:rPr>
-        <w:t xml:space="preserve">3 · Lo que se construye (F1–F6, alcance firmado) y cómo se verifica</w:t>
+        <w:t xml:space="preserve">3 · Lo que se construyó (F1–F6, alcance firmado) — as-built de la OTA 0.23.8</w:t>
       </w:r>
     </w:p>
     <w:tbl>
@@ -818,7 +818,7 @@
                 <w:sz w:val="16"/>
                 <w:szCs w:val="16"/>
               </w:rPr>
-              <w:t xml:space="preserve">Cómo se verifica</w:t>
+              <w:t xml:space="preserve">Cómo se verifica / cómo se verificó (as-built)</w:t>
             </w:r>
           </w:p>
         </w:tc>
@@ -904,7 +904,7 @@
                 <w:sz w:val="16"/>
                 <w:szCs w:val="16"/>
               </w:rPr>
-              <w:t xml:space="preserve">Captura en un iPhone Y un Android con la salud conectada (paridad): 3 cifras en ese orden y el enlace; al tocarlo, las 4 más y la fecha; sin salud conectada la tarjeta sigue sin aparecer.</w:t>
+              <w:t xml:space="preserve">Captura en un iPhone Y un Android con la salud conectada (paridad): 3 cifras en ese orden y el enlace; al tocarlo, las 4 más y la fecha; sin salud conectada la tarjeta sigue sin aparecer. ▶ AS-BUILT 28-sep: MovementLogScreen.tsx (bloque r24-o): primera rejilla [hoy · fase · ciclo] al tercio; Pressable «Ver más ›» / «Ver menos» con estado local `cockpitMas` (plegado en cada apertura, nada se persiste); segunda rejilla [mes · trimestre · ytd · total] y la línea «Datos desde el {d}» (toLocaleDateString del primer día con pasos, con T12:00:00 para no cruzar la medianoche). VERIFICADO en el iPhone de Juanjo (runtime 0.23.1, 28-sep ~21:45, chat: «OK» a las tres cifras, «Ver más» y «Datos desde»). ANDROID PENDIENTE: la tarjeta exige Health Connect conectado en 0.23.0/0.23.1 y el Android de Juanjo corre 0.22.0 (sin módulo) → va con la verificación de la 0.23.7 (item ampliado en el SQL de cierre). Sin salud conectada la tarjeta sigue sin aparecer (condición r24-o intacta).</w:t>
             </w:r>
           </w:p>
         </w:tc>
@@ -990,7 +990,7 @@
                 <w:sz w:val="16"/>
                 <w:szCs w:val="16"/>
               </w:rPr>
-              <w:t xml:space="preserve">jest: `cockpit.test.ts` intacto + casos nuevos de `primerDiaConPasos` (vacío → null; ignora filas a 0; el más antiguo). `tsc` 0.</w:t>
+              <w:t xml:space="preserve">jest: `cockpit.test.ts` intacto + casos nuevos de `primerDiaConPasos` (vacío → null; ignora filas a 0; el más antiguo). `tsc` 0. ▶ AS-BUILT 28-sep: cockpit.ts: `BucketPasos` y `agregaPasos` intactos; `primerDiaConPasos(filas)` (PURA: null si vacío, ignora filas a 0, devuelve el día más antiguo) y `cargarCockpitPasos` devuelve `{…agregaPasos, primerDia}` (tipo `CockpitPasos`). cockpit.test.ts +3 casos. jest 28 suites · 489/489 (482 + 7) · tsc 0.</w:t>
             </w:r>
           </w:p>
         </w:tc>
@@ -1076,7 +1076,7 @@
                 <w:sz w:val="16"/>
                 <w:szCs w:val="16"/>
               </w:rPr>
-              <w:t xml:space="preserve">Test de la pantalla no hay (jest de lógica pura): el orden se verifica en la captura; las definiciones, en los tests de `agregaPasos` que ya existen.</w:t>
+              <w:t xml:space="preserve">Test de la pantalla no hay (jest de lógica pura): el orden se verifica en la captura; las definiciones, en los tests de `agregaPasos` que ya existen. ▶ AS-BUILT 28-sep: El array de celdas de la pantalla fija el orden hoy → fase → ciclo; `agregaPasos` no cambia (sus tests siguen). Orden verificado en el iPhone (Today · This phase · This cycle).</w:t>
             </w:r>
           </w:p>
         </w:tc>
@@ -1162,7 +1162,7 @@
                 <w:sz w:val="16"/>
                 <w:szCs w:val="16"/>
               </w:rPr>
-              <w:t xml:space="preserve">`catalogos.test.ts` (bloque `mob.wear` cerrado): paridad 14/14, sin vacíos, sin copias del inglés.</w:t>
+              <w:t xml:space="preserve">`catalogos.test.ts` (bloque `mob.wear` cerrado): paridad 14/14, sin vacíos, sin copias del inglés. ▶ AS-BUILT 28-sep: +3 claves `mob.wear.verMas` · `mob.wear.verMenos` · `mob.wear.datosDesde` en los 14 catálogos (es: «Ver más» · «Ver menos» · «Datos desde el {d}»); las 7 `mob.wear.b.*` se quedan. catalogos.test.ts (bloque mob.wear CERRADO) en verde: paridad 14/14, sin vacíos, sin copias del inglés.</w:t>
             </w:r>
           </w:p>
         </w:tc>
@@ -1248,7 +1248,7 @@
                 <w:sz w:val="16"/>
                 <w:szCs w:val="16"/>
               </w:rPr>
-              <w:t xml:space="preserve">Unitarios de la parte pura (`diasARellenar`: rango, corte en el día anterior al primero con horas, vacío cuando no hace falta). En el iPhone de Juanjo: tras la OTA, «Ver más» enseña Year to date y All time distintos de This cycle y «Datos desde» una fecha de meses atrás; en la base, filas `steps` con `metadata.granularidad = 'dia'` anteriores al 14-sep. Android: la fecha de «Datos desde» ≈ 30 días antes de la conexión.</w:t>
+              <w:t xml:space="preserve">Unitarios de la parte pura (`diasARellenar`: rango, corte en el día anterior al primero con horas, vacío cuando no hace falta). En el iPhone de Juanjo: tras la OTA, «Ver más» enseña Year to date y All time distintos de This cycle y «Datos desde» una fecha de meses atrás; en la base, filas `steps` con `metadata.granularidad = 'dia'` anteriores al 14-sep. Android: la fecha de «Datos desde» ≈ 30 días antes de la conexión. ▶ AS-BUILT 28-sep: sync.ts: `diasARellenar(masAntiguoISO, ahoraISO, maxDias = 730)` (PURA: null si no hay dato previo o ya se llegó al suelo; `hasta` = medianoche local del día más antiguo con horas) + `rellenarHistorialPasos(userId, ad)` (Set `rellenoHecho` por usuaria y proceso → una vez por arranque; lee la fila de pasos más antigua, pide `ad.pasosPorDia`, dedupe + `toSignalRow`, upsert en lotes de 200 con ignoreDuplicates), llamado en `syncSaludAlAbrir` DESPUÉS de la ventana normal y solo si hubo pasos. healthkit.ts `hkPasosAgregados(desde, hasta, «hora»|«dia»)` → `hkPasosPorDia` = queryStatisticsCollectionForQuantity con {day:1} anclado a medianoche local, end = fin del bucket − 1 s, metadata {fuente: hk_merged, granularidad: dia}; healthconnect.ts `hcPasosPorDia` = aggregateGroupByDuration con {duration: DAYS, length: 1}; adaptador.ts `pasosPorDia` en el contrato. health-sync.test.ts +4 (`diasARellenar`). La desviación TEMPORAL de Android (≤30 días sin READ_HEALTH_DATA_HISTORY → 0.24.0) queda tal como se declaró. PENDIENTE de medir en producción: la sonda de solo lectura `2026-09-28-sonda-relleno-pasos-0-23-8.sql` (filas `steps` con granularidad = dia por usuaria, día más antiguo) y la fecha concreta de «Datos desde» en el iPhone (el «OK» de Juanjo no la anota).</w:t>
             </w:r>
           </w:p>
         </w:tc>
@@ -1334,7 +1334,7 @@
                 <w:sz w:val="16"/>
                 <w:szCs w:val="16"/>
               </w:rPr>
-              <w:t xml:space="preserve">DoD: en el móvil de Juanjo y en el de Pilar la tarjeta enseña Today · This phase · This cycle + «Ver más» con las cuatro y la fecha; el resto de la pantalla idéntico. Marcha atrás: `Rollback OTA NutriSync.command` al mensaje de la OTA anterior.</w:t>
+              <w:t xml:space="preserve">DoD: en el móvil de Juanjo y en el de Pilar la tarjeta enseña Today · This phase · This cycle + «Ver más» con las cuatro y la fecha; el resto de la pantalla idéntico. Marcha atrás: `Rollback OTA NutriSync.command` al mensaje de la OTA anterior. ▶ AS-BUILT 28-sep: PASO 0 ota-baseline 21:12:43 (los 14 ids del 8-sep) → OTA PARCIAL al runtime 0.23.1·iOS (update 01a0e939-12e8-71b2-8e72-feffaea32a30, grupo 6685fad1…) → «OK» de Juanjo en su iPhone → OTA a los 7 runtimes 21:26:00–21:27:59 EEST (14 update-id 01a0e944-4434… → 01a0e946-1656…; ota-baseline 21:34:53 = archive/logs/ota-baseline-20260928-213453.txt) → PWA reconstruida y desplegada 21:36 (pwa-tests todo verde: 163 ficheros espejados, versión 0.23.1, bundle index-6b7e5f41…; d7dfca82.nutrisync-m.pages.dev — en el navegador la tarjeta no existe: sin módulo de salud). What to Test: App-Feedback-2026-09-27/WHAT-TO-TEST-0.23.8.md. Cierre: backend-sql/2026-09-28-cierre-ota-0-23-8.sql (NS-0080 → resuelto con la nota de la release como respuesta in-app → cerrado por el trigger de la release · item S19 hecho y casado con el ticket · release en_tiendas · item Android ampliado), probado en tools/sql-arnes/2026-09-28-cierre-0-23-8/ (4 escenarios: guarda sin release, real, idempotente, item del puente). DESVIACIONES de método: (a) el runtime 0.23.1·iOS recibió dos updates con el mismo bundle (el parcial y el de los 7); inofensivo, el manifest sirve el último. (b) «Build NutriSync PWA.command» se lanzó mientras corría la OTA a los 7 y su guardián de backup abortó por app.json (el .command de la OTA lo va cambiando runtime a runtime y lo restaura al final): no era deuda, era otro proceso en vuelo; un .command se espera al ✅ del anterior. (c) La verificación en iPhone quedó como «OK» en el chat, sin captura archivada (la DoD pedía captura). (d) Android pendiente (F1).</w:t>
             </w:r>
           </w:p>
         </w:tc>
@@ -2752,6 +2752,65 @@
                 <w:szCs w:val="16"/>
               </w:rPr>
               <w:t xml:space="preserve">Qué se comprueba</w:t>
+            </w:r>
+          </w:p>
+        </w:tc>
+      </w:tr>
+      <w:tr>
+        <w:trPr>
+          <w:cantSplit/>
+        </w:trPr>
+        <w:tc>
+          <w:tcPr>
+            <w:tcW w:type="dxa" w:w="2266"/>
+            <w:tcMar>
+              <w:top w:type="dxa" w:w="70"/>
+              <w:left w:type="dxa" w:w="100"/>
+              <w:bottom w:type="dxa" w:w="70"/>
+              <w:right w:type="dxa" w:w="100"/>
+            </w:tcMar>
+          </w:tcPr>
+          <w:p>
+            <w:pPr>
+              <w:spacing w:after="40"/>
+            </w:pPr>
+            <w:r>
+              <w:rPr>
+                <w:rFonts w:ascii="Aptos" w:cs="Aptos" w:eastAsia="Aptos" w:hAnsi="Aptos"/>
+                <w:b/>
+                <w:bCs/>
+                <w:color w:val="6B6B6B"/>
+                <w:sz w:val="16"/>
+                <w:szCs w:val="16"/>
+              </w:rPr>
+              <w:t xml:space="preserve">As-built · lo medido (28-sep 21:34–21:5x)</w:t>
+            </w:r>
+          </w:p>
+        </w:tc>
+        <w:tc>
+          <w:tcPr>
+            <w:tcW w:type="dxa" w:w="8034"/>
+            <w:tcMar>
+              <w:top w:type="dxa" w:w="70"/>
+              <w:left w:type="dxa" w:w="100"/>
+              <w:bottom w:type="dxa" w:w="70"/>
+              <w:right w:type="dxa" w:w="100"/>
+            </w:tcMar>
+          </w:tcPr>
+          <w:p>
+            <w:pPr>
+              <w:spacing w:after="40"/>
+            </w:pPr>
+            <w:r>
+              <w:rPr>
+                <w:rFonts w:ascii="Aptos" w:cs="Aptos" w:eastAsia="Aptos" w:hAnsi="Aptos"/>
+                <w:b w:val="false"/>
+                <w:bCs w:val="false"/>
+                <w:color w:val="6B6B6B"/>
+                <w:sz w:val="16"/>
+                <w:szCs w:val="16"/>
+              </w:rPr>
+              <w:t xml:space="preserve">14/14 update-id nuevos (18:26–18:28Z) en los 7 runtimes × 2 plataformas · appdev 5741f18 limpio y subido · jest 489/489 · tsc 0 · pwa-tests todo verde · iPhone de Juanjo: OK · ANDROID: PENDIENTE (con la 0.23.7) · Pilar: PENDIENTE (cerrar la app dos veces) · filas diarias del relleno: PENDIENTE (sonda de solo lectura) · tablero: SQL de cierre entregado (arnés PG16 en verde).</w:t>
             </w:r>
           </w:p>
         </w:tc>
@@ -3383,6 +3442,124 @@
           </w:p>
         </w:tc>
       </w:tr>
+      <w:tr>
+        <w:trPr>
+          <w:cantSplit/>
+        </w:trPr>
+        <w:tc>
+          <w:tcPr>
+            <w:tcW w:type="dxa" w:w="2678"/>
+            <w:tcMar>
+              <w:top w:type="dxa" w:w="70"/>
+              <w:left w:type="dxa" w:w="100"/>
+              <w:bottom w:type="dxa" w:w="70"/>
+              <w:right w:type="dxa" w:w="100"/>
+            </w:tcMar>
+          </w:tcPr>
+          <w:p>
+            <w:pPr>
+              <w:spacing w:after="40"/>
+            </w:pPr>
+            <w:r>
+              <w:rPr>
+                <w:rFonts w:ascii="Aptos" w:cs="Aptos" w:eastAsia="Aptos" w:hAnsi="Aptos"/>
+                <w:b/>
+                <w:bCs/>
+                <w:color w:val="6B6B6B"/>
+                <w:sz w:val="16"/>
+                <w:szCs w:val="16"/>
+              </w:rPr>
+              <w:t xml:space="preserve">Dos .command a la vez se pisan aunque toquen ficheros distintos</w:t>
+            </w:r>
+          </w:p>
+        </w:tc>
+        <w:tc>
+          <w:tcPr>
+            <w:tcW w:type="dxa" w:w="7622"/>
+            <w:tcMar>
+              <w:top w:type="dxa" w:w="70"/>
+              <w:left w:type="dxa" w:w="100"/>
+              <w:bottom w:type="dxa" w:w="70"/>
+              <w:right w:type="dxa" w:w="100"/>
+            </w:tcMar>
+          </w:tcPr>
+          <w:p>
+            <w:pPr>
+              <w:spacing w:after="40"/>
+            </w:pPr>
+            <w:r>
+              <w:rPr>
+                <w:rFonts w:ascii="Aptos" w:cs="Aptos" w:eastAsia="Aptos" w:hAnsi="Aptos"/>
+                <w:b w:val="false"/>
+                <w:bCs w:val="false"/>
+                <w:color w:val="6B6B6B"/>
+                <w:sz w:val="16"/>
+                <w:szCs w:val="16"/>
+              </w:rPr>
+              <w:t xml:space="preserve">El guardián de backup del build de la PWA leyó app.json a medias de la OTA a los 7 runtimes (el .command de la OTA lo cambia runtime a runtime y lo restaura al final) y abortó con «1 fichero sin commitear». No era deuda: era otro proceso en vuelo. Un .command se espera al ✅ del anterior — regla 6 del protocolo de copias, aplicada a los propios .command.</w:t>
+            </w:r>
+          </w:p>
+        </w:tc>
+      </w:tr>
+      <w:tr>
+        <w:trPr>
+          <w:cantSplit/>
+        </w:trPr>
+        <w:tc>
+          <w:tcPr>
+            <w:tcW w:type="dxa" w:w="2678"/>
+            <w:tcMar>
+              <w:top w:type="dxa" w:w="70"/>
+              <w:left w:type="dxa" w:w="100"/>
+              <w:bottom w:type="dxa" w:w="70"/>
+              <w:right w:type="dxa" w:w="100"/>
+            </w:tcMar>
+          </w:tcPr>
+          <w:p>
+            <w:pPr>
+              <w:spacing w:after="40"/>
+            </w:pPr>
+            <w:r>
+              <w:rPr>
+                <w:rFonts w:ascii="Aptos" w:cs="Aptos" w:eastAsia="Aptos" w:hAnsi="Aptos"/>
+                <w:b/>
+                <w:bCs/>
+                <w:color w:val="6B6B6B"/>
+                <w:sz w:val="16"/>
+                <w:szCs w:val="16"/>
+              </w:rPr>
+              <w:t xml:space="preserve">La verificación se anota con quién, cuándo y en qué runtime — y lo que no se ha mirado se escribe como pendiente</w:t>
+            </w:r>
+          </w:p>
+        </w:tc>
+        <w:tc>
+          <w:tcPr>
+            <w:tcW w:type="dxa" w:w="7622"/>
+            <w:tcMar>
+              <w:top w:type="dxa" w:w="70"/>
+              <w:left w:type="dxa" w:w="100"/>
+              <w:bottom w:type="dxa" w:w="70"/>
+              <w:right w:type="dxa" w:w="100"/>
+            </w:tcMar>
+          </w:tcPr>
+          <w:p>
+            <w:pPr>
+              <w:spacing w:after="40"/>
+            </w:pPr>
+            <w:r>
+              <w:rPr>
+                <w:rFonts w:ascii="Aptos" w:cs="Aptos" w:eastAsia="Aptos" w:hAnsi="Aptos"/>
+                <w:b w:val="false"/>
+                <w:bCs w:val="false"/>
+                <w:color w:val="6B6B6B"/>
+                <w:sz w:val="16"/>
+                <w:szCs w:val="16"/>
+              </w:rPr>
+              <w:t xml:space="preserve">El cierre lleva «iPhone de Juanjo, runtime 0.23.1, 28-sep ~21:45, OK por chat» y deja Android, la fecha de «Datos desde» y las filas diarias como PENDIENTES con su sonda y su item. Lo que no se ha visto no se da por visto (paridad, punto 4).</w:t>
+            </w:r>
+          </w:p>
+        </w:tc>
+      </w:tr>
     </w:tbl>
     <w:p>
       <w:pPr>
@@ -3651,7 +3828,7 @@
                 <w:sz w:val="16"/>
                 <w:szCs w:val="16"/>
               </w:rPr>
-              <w:t xml:space="preserve">Una jornada: pantalla (3 + ver más) · cockpit (`primerDiaConPasos`) · sync (relleno diario, una vez) · adaptadores (`pasosPorDia` iOS/Android) · tests · 14 catálogos; un commit en appdev.</w:t>
+              <w:t xml:space="preserve">HECHO (28-sep 18:36 EEST): appdev 5741f18, 22 ficheros — pantalla (3 + ver más + 4 + «Datos desde») · cockpit (`primerDiaConPasos`, `CockpitPasos`) · sync (relleno diario, una vez) · healthkit/healthconnect (`pasosAgregados` hora|día) · adaptador (`pasosPorDia`) · tests +7 · 14 catálogos (+3 claves).</w:t>
             </w:r>
           </w:p>
         </w:tc>
@@ -3710,7 +3887,7 @@
                 <w:sz w:val="16"/>
                 <w:szCs w:val="16"/>
               </w:rPr>
-              <w:t xml:space="preserve">jest (cockpit, sync puro, catálogos) · tsc 0 · expo config · captura iPhone + Android.</w:t>
+              <w:t xml:space="preserve">HECHO: jest 28 suites · 489/489 · tsc 0 · expo config OK · pwa-tests todo verde (21:36) · arnés PG16 del cierre (4 escenarios).</w:t>
             </w:r>
           </w:p>
         </w:tc>
@@ -3769,7 +3946,7 @@
                 <w:sz w:val="16"/>
                 <w:szCs w:val="16"/>
               </w:rPr>
-              <w:t xml:space="preserve">OTA 0.23.8: runtime de Juanjo → 7 runtimes (`tools/OTA NutriSync App.command` con mensaje).</w:t>
+              <w:t xml:space="preserve">HECHO: OTA 0.23.8 parcial (0.23.1·iOS, 01a0e939) → 7 runtimes 21:26–21:28 EEST (14 ids 01a0e944…946) → PWA m. reconstruida (d7dfca82). Marcha atrás: Rollback OTA NutriSync.command con un trozo del mensaje de la OTA anterior.</w:t>
             </w:r>
           </w:p>
         </w:tc>
@@ -3828,7 +4005,7 @@
                 <w:sz w:val="16"/>
                 <w:szCs w:val="16"/>
               </w:rPr>
-              <w:t xml:space="preserve">`curl u.expo.dev` por runtime + DoD en dos móviles + Pilar en el suyo.</w:t>
+              <w:t xml:space="preserve">iPhone (Juanjo, runtime 0.23.1): HECHA por chat («OK») · ota-baseline 21:34: 14/14 nuevos · Android: PENDIENTE (con la 0.23.7; el Android de Juanjo debe actualizar desde Play a 0.23.1) · Pilar en su móvil: PENDIENTE · sonda de filas diarias: PENDIENTE.</w:t>
             </w:r>
           </w:p>
         </w:tc>
@@ -3887,7 +4064,7 @@
                 <w:sz w:val="16"/>
                 <w:szCs w:val="16"/>
               </w:rPr>
-              <w:t xml:space="preserve">Doc 61 firmado + adjuntos SIGNED; item S19 · aceptado · 0.23.8 → hecho con la release en 🚢; ticket de Pilar resuelto con la nota (D6); as-built con desviaciones; Notion sin bloques → hub.</w:t>
+              <w:t xml:space="preserve">Hub: doc 61 as-built (po266) + adjuntos (PDF/Word as-built, PDF firmado de la propuesta + .sha256, propuesta-firmada.pdf) · tablero: 2026-09-28-cierre-ota-0-23-8.sql (ticket, item, release, Android) · Notion sin bloques → hub.</w:t>
             </w:r>
           </w:p>
         </w:tc>
@@ -4100,7 +4277,7 @@
                 <w:sz w:val="16"/>
                 <w:szCs w:val="16"/>
               </w:rPr>
-              <w:t xml:space="preserve">Ingeniería y producto (decide D1–D6, carril técnico)</w:t>
+              <w:t xml:space="preserve">Ingeniería y producto (D1–D6 firmados el 28-sep 10:25 · as-built: carril técnico, sin firma nueva)</w:t>
             </w:r>
           </w:p>
         </w:tc>
@@ -4213,7 +4390,7 @@
                 <w:sz w:val="16"/>
                 <w:szCs w:val="16"/>
               </w:rPr>
-              <w:t xml:space="preserve">CEO (pidió el cambio; corrobora)</w:t>
+              <w:t xml:space="preserve">CEO (pidió el cambio; corrobora — pendiente)</w:t>
             </w:r>
           </w:p>
         </w:tc>
@@ -4326,7 +4503,7 @@
                 <w:sz w:val="16"/>
                 <w:szCs w:val="16"/>
               </w:rPr>
-              <w:t xml:space="preserve">COO · diseño (corrobora D3)</w:t>
+              <w:t xml:space="preserve">COO · diseño (corrobora D3 — pendiente)</w:t>
             </w:r>
           </w:p>
         </w:tc>

</xml_diff>